<commit_message>
Add design report for molecular dynamics simulation project
- Introduced a comprehensive LaTeX document detailing the design, functionality, and testing of a web-based molecular dynamics simulation platform.
- Included sections on project background, teaching objectives, functional requirements, technical approach, system architecture, physical model design, user interface, core module division, detailed design of physical simulation algorithms, testing reports, installation instructions, and project summary.
- Implemented formatting and structure suitable for academic reporting, including chapters, sections, tables, and references.
</commit_message>
<xml_diff>
--- a/报名表.docx
+++ b/报名表.docx
@@ -55,7 +55,23 @@
           <w:rStyle w:val="6"/>
           <w:rFonts w:hint="eastAsia" w:asciiTheme="minorEastAsia" w:hAnsiTheme="minorEastAsia"/>
         </w:rPr>
-        <w:t>2026年第二十三届东南大学大学生物理及实验科技作品创新竞赛报名表</w:t>
+        <w:t>2026年第二十三届东南大学大学生</w:t>
+      </w:r>
+      <w:bookmarkStart w:id="0" w:name="_GoBack"/>
+      <w:r>
+        <w:rPr>
+          <w:rStyle w:val="6"/>
+          <w:rFonts w:hint="eastAsia" w:asciiTheme="minorEastAsia" w:hAnsiTheme="minorEastAsia"/>
+        </w:rPr>
+        <w:t>物理及实验科技作品创新竞赛</w:t>
+      </w:r>
+      <w:bookmarkEnd w:id="0"/>
+      <w:r>
+        <w:rPr>
+          <w:rStyle w:val="6"/>
+          <w:rFonts w:hint="eastAsia" w:asciiTheme="minorEastAsia" w:hAnsiTheme="minorEastAsia"/>
+        </w:rPr>
+        <w:t>报名表</w:t>
       </w:r>
     </w:p>
     <w:tbl>
@@ -97,12 +113,6 @@
             <w:insideH w:val="single" w:color="auto" w:sz="4" w:space="0"/>
             <w:insideV w:val="single" w:color="auto" w:sz="4" w:space="0"/>
           </w:tblBorders>
-          <w:tblCellMar>
-            <w:top w:w="0" w:type="dxa"/>
-            <w:left w:w="108" w:type="dxa"/>
-            <w:bottom w:w="0" w:type="dxa"/>
-            <w:right w:w="108" w:type="dxa"/>
-          </w:tblCellMar>
         </w:tblPrEx>
         <w:trPr>
           <w:jc w:val="center"/>
@@ -220,8 +230,14 @@
                 <w:sz w:val="24"/>
               </w:rPr>
             </w:pPr>
-            <w:bookmarkStart w:id="0" w:name="_GoBack"/>
-            <w:bookmarkEnd w:id="0"/>
+            <w:r>
+              <w:rPr>
+                <w:rStyle w:val="6"/>
+                <w:rFonts w:hint="eastAsia" w:cs="Times New Roman" w:asciiTheme="minorEastAsia" w:hAnsiTheme="minorEastAsia"/>
+                <w:sz w:val="24"/>
+              </w:rPr>
+              <w:t>绝热与等温 -- 理想气体分子动力学过程的微观对比仿真</w:t>
+            </w:r>
           </w:p>
         </w:tc>
       </w:tr>

</xml_diff>